<commit_message>
Add ethics & governance KPIs after the top 6 ESG KPIs
Co-Authored-By: Claude Opus 4.8 <noreply@anthropic.com>
Claude-Session: https://claude.ai/code/session_018VqdtPjyRkRfwSAzxj2Tpm
</commit_message>
<xml_diff>
--- a/APC-2026-Diamante-ESG-KPIs-Top6.docx
+++ b/APC-2026-Diamante-ESG-KPIs-Top6.docx
@@ -793,6 +793,359 @@
     </w:tbl>
     <w:p>
       <w:pPr>
+        <w:spacing w:before="200" w:after="60"/>
+      </w:pPr>
+      <w:r>
+        <w:rPr>
+          <w:b/>
+          <w:color w:val="1F3D6B"/>
+          <w:sz w:val="23"/>
+        </w:rPr>
+        <w:t>Ethics &amp; governance KPIs (include in addition to the six above)</w:t>
+      </w:r>
+    </w:p>
+    <w:p>
+      <w:pPr>
+        <w:pStyle w:val="ListBullet"/>
+        <w:spacing w:after="60"/>
+      </w:pPr>
+      <w:r>
+        <w:rPr>
+          <w:sz w:val="20"/>
+        </w:rPr>
+        <w:t>These sit alongside the six as the governance layer, because King IV expects ethical and diverse leadership as well as good outcomes.</w:t>
+      </w:r>
+    </w:p>
+    <w:tbl>
+      <w:tblPr>
+        <w:tblStyle w:val="TableGrid"/>
+        <w:tblW w:type="auto" w:w="0"/>
+        <w:jc w:val="center"/>
+        <w:tblLook w:firstColumn="1" w:firstRow="1" w:lastColumn="0" w:lastRow="0" w:noHBand="0" w:noVBand="1" w:val="04A0"/>
+      </w:tblPr>
+      <w:tblGrid>
+        <w:gridCol w:w="1800"/>
+        <w:gridCol w:w="1800"/>
+        <w:gridCol w:w="1800"/>
+        <w:gridCol w:w="1800"/>
+        <w:gridCol w:w="1800"/>
+        <w:gridCol w:w="1800"/>
+      </w:tblGrid>
+      <w:tr>
+        <w:tc>
+          <w:tcPr>
+            <w:tcW w:type="dxa" w:w="403"/>
+            <w:shd w:val="clear" w:fill="1f5b3a"/>
+          </w:tcPr>
+          <w:p>
+            <w:r/>
+            <w:r>
+              <w:rPr>
+                <w:b/>
+                <w:color w:val="FFFFFF"/>
+                <w:sz w:val="16"/>
+              </w:rPr>
+              <w:t>#</w:t>
+            </w:r>
+          </w:p>
+        </w:tc>
+        <w:tc>
+          <w:tcPr>
+            <w:tcW w:type="dxa" w:w="1440"/>
+            <w:shd w:val="clear" w:fill="1f5b3a"/>
+          </w:tcPr>
+          <w:p>
+            <w:r/>
+            <w:r>
+              <w:rPr>
+                <w:b/>
+                <w:color w:val="FFFFFF"/>
+                <w:sz w:val="16"/>
+              </w:rPr>
+              <w:t>ESG KPI</w:t>
+            </w:r>
+          </w:p>
+        </w:tc>
+        <w:tc>
+          <w:tcPr>
+            <w:tcW w:type="dxa" w:w="2160"/>
+            <w:shd w:val="clear" w:fill="1f5b3a"/>
+          </w:tcPr>
+          <w:p>
+            <w:r/>
+            <w:r>
+              <w:rPr>
+                <w:b/>
+                <w:color w:val="FFFFFF"/>
+                <w:sz w:val="16"/>
+              </w:rPr>
+              <w:t>Formula</w:t>
+            </w:r>
+          </w:p>
+        </w:tc>
+        <w:tc>
+          <w:tcPr>
+            <w:tcW w:type="dxa" w:w="1584"/>
+            <w:shd w:val="clear" w:fill="1f5b3a"/>
+          </w:tcPr>
+          <w:p>
+            <w:r/>
+            <w:r>
+              <w:rPr>
+                <w:b/>
+                <w:color w:val="FFFFFF"/>
+                <w:sz w:val="16"/>
+              </w:rPr>
+              <w:t>Inputs</w:t>
+            </w:r>
+          </w:p>
+        </w:tc>
+        <w:tc>
+          <w:tcPr>
+            <w:tcW w:type="dxa" w:w="1512"/>
+            <w:shd w:val="clear" w:fill="1f5b3a"/>
+          </w:tcPr>
+          <w:p>
+            <w:r/>
+            <w:r>
+              <w:rPr>
+                <w:b/>
+                <w:color w:val="FFFFFF"/>
+                <w:sz w:val="16"/>
+              </w:rPr>
+              <w:t>Output</w:t>
+            </w:r>
+          </w:p>
+        </w:tc>
+        <w:tc>
+          <w:tcPr>
+            <w:tcW w:type="dxa" w:w="3773"/>
+            <w:shd w:val="clear" w:fill="1f5b3a"/>
+          </w:tcPr>
+          <w:p>
+            <w:r/>
+            <w:r>
+              <w:rPr>
+                <w:b/>
+                <w:color w:val="FFFFFF"/>
+                <w:sz w:val="16"/>
+              </w:rPr>
+              <w:t>Why it is best for Diamante</w:t>
+            </w:r>
+          </w:p>
+        </w:tc>
+      </w:tr>
+      <w:tr>
+        <w:tc>
+          <w:tcPr>
+            <w:tcW w:type="dxa" w:w="403"/>
+          </w:tcPr>
+          <w:p>
+            <w:pPr>
+              <w:spacing w:after="20"/>
+            </w:pPr>
+            <w:r/>
+            <w:r>
+              <w:rPr>
+                <w:sz w:val="16"/>
+              </w:rPr>
+              <w:t>7</w:t>
+            </w:r>
+          </w:p>
+        </w:tc>
+        <w:tc>
+          <w:tcPr>
+            <w:tcW w:type="dxa" w:w="1440"/>
+          </w:tcPr>
+          <w:p>
+            <w:pPr>
+              <w:spacing w:after="20"/>
+            </w:pPr>
+            <w:r/>
+            <w:r>
+              <w:rPr>
+                <w:sz w:val="16"/>
+              </w:rPr>
+              <w:t>Ethics &amp; compliance</w:t>
+            </w:r>
+          </w:p>
+        </w:tc>
+        <w:tc>
+          <w:tcPr>
+            <w:tcW w:type="dxa" w:w="2160"/>
+          </w:tcPr>
+          <w:p>
+            <w:pPr>
+              <w:spacing w:after="20"/>
+            </w:pPr>
+            <w:r/>
+            <w:r>
+              <w:rPr>
+                <w:sz w:val="16"/>
+              </w:rPr>
+              <w:t>No formula — count of breaches, whistleblower reports and regulatory findings</w:t>
+            </w:r>
+          </w:p>
+        </w:tc>
+        <w:tc>
+          <w:tcPr>
+            <w:tcW w:type="dxa" w:w="1584"/>
+          </w:tcPr>
+          <w:p>
+            <w:pPr>
+              <w:spacing w:after="20"/>
+            </w:pPr>
+            <w:r/>
+            <w:r>
+              <w:rPr>
+                <w:sz w:val="16"/>
+              </w:rPr>
+              <w:t>Number of compliance breaches, whistleblower reports and findings</w:t>
+            </w:r>
+          </w:p>
+        </w:tc>
+        <w:tc>
+          <w:tcPr>
+            <w:tcW w:type="dxa" w:w="1512"/>
+          </w:tcPr>
+          <w:p>
+            <w:pPr>
+              <w:spacing w:after="20"/>
+            </w:pPr>
+            <w:r/>
+            <w:r>
+              <w:rPr>
+                <w:sz w:val="16"/>
+              </w:rPr>
+              <w:t>Number of ethics and compliance incidents</w:t>
+            </w:r>
+          </w:p>
+        </w:tc>
+        <w:tc>
+          <w:tcPr>
+            <w:tcW w:type="dxa" w:w="3773"/>
+          </w:tcPr>
+          <w:p>
+            <w:pPr>
+              <w:spacing w:after="20"/>
+            </w:pPr>
+            <w:r/>
+            <w:r>
+              <w:rPr>
+                <w:sz w:val="16"/>
+              </w:rPr>
+              <w:t>A low number supports King IV and protects Diamante from fines and reputational damage in a business already under scrutiny.</w:t>
+            </w:r>
+          </w:p>
+        </w:tc>
+      </w:tr>
+      <w:tr>
+        <w:tc>
+          <w:tcPr>
+            <w:tcW w:type="dxa" w:w="403"/>
+          </w:tcPr>
+          <w:p>
+            <w:pPr>
+              <w:spacing w:after="20"/>
+            </w:pPr>
+            <w:r/>
+            <w:r>
+              <w:rPr>
+                <w:sz w:val="16"/>
+              </w:rPr>
+              <w:t>8</w:t>
+            </w:r>
+          </w:p>
+        </w:tc>
+        <w:tc>
+          <w:tcPr>
+            <w:tcW w:type="dxa" w:w="1440"/>
+          </w:tcPr>
+          <w:p>
+            <w:pPr>
+              <w:spacing w:after="20"/>
+            </w:pPr>
+            <w:r/>
+            <w:r>
+              <w:rPr>
+                <w:sz w:val="16"/>
+              </w:rPr>
+              <w:t>Diversity (women)</w:t>
+            </w:r>
+          </w:p>
+        </w:tc>
+        <w:tc>
+          <w:tcPr>
+            <w:tcW w:type="dxa" w:w="2160"/>
+          </w:tcPr>
+          <w:p>
+            <w:pPr>
+              <w:spacing w:after="20"/>
+            </w:pPr>
+            <w:r/>
+            <w:r>
+              <w:rPr>
+                <w:sz w:val="16"/>
+              </w:rPr>
+              <w:t>Women % = women ÷ total × 100 (workforce, management and board)</w:t>
+            </w:r>
+          </w:p>
+        </w:tc>
+        <w:tc>
+          <w:tcPr>
+            <w:tcW w:type="dxa" w:w="1584"/>
+          </w:tcPr>
+          <w:p>
+            <w:pPr>
+              <w:spacing w:after="20"/>
+            </w:pPr>
+            <w:r/>
+            <w:r>
+              <w:rPr>
+                <w:sz w:val="16"/>
+              </w:rPr>
+              <w:t>Number of women; total headcount at each level</w:t>
+            </w:r>
+          </w:p>
+        </w:tc>
+        <w:tc>
+          <w:tcPr>
+            <w:tcW w:type="dxa" w:w="1512"/>
+          </w:tcPr>
+          <w:p>
+            <w:pPr>
+              <w:spacing w:after="20"/>
+            </w:pPr>
+            <w:r/>
+            <w:r>
+              <w:rPr>
+                <w:sz w:val="16"/>
+              </w:rPr>
+              <w:t>Share of women at each level</w:t>
+            </w:r>
+          </w:p>
+        </w:tc>
+        <w:tc>
+          <w:tcPr>
+            <w:tcW w:type="dxa" w:w="3773"/>
+          </w:tcPr>
+          <w:p>
+            <w:pPr>
+              <w:spacing w:after="20"/>
+            </w:pPr>
+            <w:r/>
+            <w:r>
+              <w:rPr>
+                <w:sz w:val="16"/>
+              </w:rPr>
+              <w:t>It supports King IV board and workforce diversity and South African transformation expectations in mining.</w:t>
+            </w:r>
+          </w:p>
+        </w:tc>
+      </w:tr>
+    </w:tbl>
+    <w:p>
+      <w:pPr>
         <w:spacing w:after="80"/>
       </w:pPr>
       <w:r>

</xml_diff>